<commit_message>
Corrige la série normalisée du rapport R des compteurs
L'état de l'art annonçait une liste incomplète (R40, R80, R160, R200,
R400, R630, R1000). EN ISO 4064-1:2014 fait choisir R dans la série de
nombres normaux 40, 50, 63, 80, 100, 125, 160, 200, 250, 315, 400, 500,
630, 800, 1000. Les valeurs manquantes — dont R250 et R100 — sont
courantes au catalogue, et leur absence rendait la liste trompeuse au
moment de comparer des références réelles.

Corrigé dans docs/etat-de-l-art.md et dans les deux scripts de génération.
Les deux .docx sont régénérés ; la version complète reste à 6 pages.

Co-Authored-By: Claude Opus 5 <noreply@anthropic.com>
Claude-Session: https://claude.ai/code/session_01DGGfCD6qThzdifW5Zpbw8C
</commit_message>
<xml_diff>
--- a/docs/Etat-de-l-art-complet.docx
+++ b/docs/Etat-de-l-art-complet.docx
@@ -2146,7 +2146,7 @@
           <w:sz w:val="18"/>
           <w:szCs w:val="18"/>
         </w:rPr>
-        <w:t xml:space="preserve">Directive MID annexe MI-001 [17], OIML R 49 [16], EN ISO 4064. Un sous-compteur interne ne servant pas de base à une facturation entre tiers, l'approbation MID n'est pas juridiquement requise — mais elle reste le meilleur repère de qualité et garantit des classes comparables d'un fabricant à l'autre. Un compteur est caractérisé par R = Q3/Q1 (valeurs normalisées R40 à R1000 ; R160 = ancienne classe C), avec Q1 = Q3/R, Q2 = 1,6 × Q1 et Q4 = 1,25 × Q3.</w:t>
+        <w:t xml:space="preserve">Directive MID annexe MI-001 [17], OIML R 49 [16], EN ISO 4064. Un sous-compteur interne ne servant pas de base à une facturation entre tiers, l'approbation MID n'est pas juridiquement requise — mais elle reste le meilleur repère de qualité et garantit des classes comparables d'un fabricant à l'autre. Un compteur est caractérisé par R = Q3/Q1, choisi dans la série normalisée 40, 50, 63, 80, 100, 125, 160, 200, 250, 315, 400, 500, 630, 800, 1000 (R160 = ancienne classe C), avec Q1 = Q3/R, Q2 = 1,6 × Q1 et Q4 = 1,25 × Q3.</w:t>
       </w:r>
     </w:p>
     <w:tbl>
@@ -7627,7 +7627,7 @@
         </w:rPr>
         <w:t xml:space="preserve">, mars 2025 — </w:t>
       </w:r>
-      <w:hyperlink w:history="1" r:id="rIdl4odq9xvgwp1kmpc49hmg">
+      <w:hyperlink w:history="1" r:id="rIdcrd-n2p1zedxkwfmzfewc">
         <w:r>
           <w:rPr>
             <w:rFonts w:ascii="Calibri" w:cs="Calibri" w:eastAsia="Calibri" w:hAnsi="Calibri"/>
@@ -8092,7 +8092,7 @@
         </w:rPr>
         <w:t xml:space="preserve"> — </w:t>
       </w:r>
-      <w:hyperlink w:history="1" r:id="rIdaehrmc1o8ptons2vpmjas">
+      <w:hyperlink w:history="1" r:id="rIdh8tzhzxvmymrudmzl52q5">
         <w:r>
           <w:rPr>
             <w:rFonts w:ascii="Calibri" w:cs="Calibri" w:eastAsia="Calibri" w:hAnsi="Calibri"/>
@@ -8139,7 +8139,7 @@
         </w:rPr>
         <w:t xml:space="preserve">Directive 2014/32/UE (MID), annexe MI-001 — </w:t>
       </w:r>
-      <w:hyperlink w:history="1" r:id="rIdola8bidfs_eis-jyz_qbe">
+      <w:hyperlink w:history="1" r:id="rIdhewudk-eypukeblwk0wtk">
         <w:r>
           <w:rPr>
             <w:rFonts w:ascii="Calibri" w:cs="Calibri" w:eastAsia="Calibri" w:hAnsi="Calibri"/>
@@ -8315,7 +8315,7 @@
         </w:rPr>
         <w:t xml:space="preserve">ChirpStack — </w:t>
       </w:r>
-      <w:hyperlink w:history="1" r:id="rId8wjytbm8py3jgxyix4t0p">
+      <w:hyperlink w:history="1" r:id="rId28_2sm9q3c-pooqoadwf6">
         <w:r>
           <w:rPr>
             <w:rFonts w:ascii="Calibri" w:cs="Calibri" w:eastAsia="Calibri" w:hAnsi="Calibri"/>
@@ -8496,7 +8496,7 @@
         </w:rPr>
         <w:t xml:space="preserve">Semtech, </w:t>
       </w:r>
-      <w:hyperlink w:history="1" r:id="rIdwpcboy4iyrccylalsucag">
+      <w:hyperlink w:history="1" r:id="rIdcq773ddttn-0kiflrrxrv">
         <w:r>
           <w:rPr>
             <w:rFonts w:ascii="Calibri" w:cs="Calibri" w:eastAsia="Calibri" w:hAnsi="Calibri"/>
@@ -8589,7 +8589,7 @@
         </w:rPr>
         <w:t xml:space="preserve">ETSI EN 300 220, dispositifs à courte portée sous 1 GHz. Application pratique : </w:t>
       </w:r>
-      <w:hyperlink w:history="1" r:id="rIdkl52pjlvkg1y3ieb0brus">
+      <w:hyperlink w:history="1" r:id="rIdehkx-t0fju3ze4mzzhtpu">
         <w:r>
           <w:rPr>
             <w:rFonts w:ascii="Calibri" w:cs="Calibri" w:eastAsia="Calibri" w:hAnsi="Calibri"/>
@@ -8627,7 +8627,7 @@
         </w:rPr>
         <w:t xml:space="preserve">Recommandation ITU-R P.1238-9 (06/2017), propagation en intérieur — </w:t>
       </w:r>
-      <w:hyperlink w:history="1" r:id="rIdk9nlktpoggdfwnwoycl5m">
+      <w:hyperlink w:history="1" r:id="rIdnqfi5ugrkrotvah8gv11m">
         <w:r>
           <w:rPr>
             <w:rFonts w:ascii="Calibri" w:cs="Calibri" w:eastAsia="Calibri" w:hAnsi="Calibri"/>
@@ -8733,7 +8733,7 @@
         </w:rPr>
         <w:t xml:space="preserve"> — </w:t>
       </w:r>
-      <w:hyperlink w:history="1" r:id="rIdwgft0yuspei9dexrqvj7g">
+      <w:hyperlink w:history="1" r:id="rIdwfmfeiuvo60bwd7xuq2ge">
         <w:r>
           <w:rPr>
             <w:rFonts w:ascii="Calibri" w:cs="Calibri" w:eastAsia="Calibri" w:hAnsi="Calibri"/>

</xml_diff>